<commit_message>
Update ig... PCB still doesnt work :(
</commit_message>
<xml_diff>
--- a/Senior Research/Proposal/WYVERN_E4_Proposal_rev2.docx
+++ b/Senior Research/Proposal/WYVERN_E4_Proposal_rev2.docx
@@ -2,32 +2,6 @@
 <file path=word/document.xml><?xml version="1.0" encoding="utf-8"?>
 <w:document xmlns:w="http://schemas.openxmlformats.org/wordprocessingml/2006/main" xmlns:m="http://schemas.openxmlformats.org/officeDocument/2006/math" xmlns:r="http://schemas.openxmlformats.org/officeDocument/2006/relationships" xmlns:o="urn:schemas-microsoft-com:office:office" xmlns:v="urn:schemas-microsoft-com:vml" xmlns:w10="urn:schemas-microsoft-com:office:word" xmlns:a="http://schemas.openxmlformats.org/drawingml/2006/main" xmlns:pic="http://schemas.openxmlformats.org/drawingml/2006/picture" xmlns:wp="http://schemas.openxmlformats.org/drawingml/2006/wordprocessingDrawing">
   <w:body>
-    <w:sdt>
-      <w:sdtPr>
-        <w:docPartObj>
-          <w:docPartGallery w:val="Table of Contents"/>
-          <w:docPartUnique/>
-        </w:docPartObj>
-      </w:sdtPr>
-      <w:sdtContent>
-        <w:p>
-          <w:pPr>
-            <w:pStyle w:val="TOCHeading"/>
-          </w:pPr>
-          <w:r>
-            <w:t xml:space="preserve">Table of Contents</w:t>
-          </w:r>
-        </w:p>
-        <w:p>
-          <w:r>
-            <w:fldChar w:fldCharType="begin" w:dirty="true"/>
-            <w:instrText xml:space="preserve">TOC \o "1-2" \h \z \u</w:instrText>
-            <w:fldChar w:fldCharType="separate"/>
-            <w:fldChar w:fldCharType="end"/>
-          </w:r>
-        </w:p>
-      </w:sdtContent>
-    </w:sdt>
     <w:p>
       <w:pPr>
         <w:pStyle w:val="Heading1"/>
@@ -37,17 +11,6 @@
         <w:t xml:space="preserve">GTR70E WYVERN (Widespread Yield Variable Engagement Rapid-response Neutralizer): Engineering Design and Experimental Validation of Closed-Loop Thrust-Vector Control, Hybrid Passive–Active Stability, and Zoned Additive-Manufacturing Materials in a Subscale Single Stage Solid-Fuelled Prototype Rocket Demonstrator</w:t>
       </w:r>
       <w:bookmarkEnd w:id="20"/>
-    </w:p>
-    <w:p>
-      <w:pPr>
-        <w:pStyle w:val="FirstParagraph"/>
-      </w:pPr>
-      <w:r>
-        <w:rPr>
-          <w:i/>
-        </w:rPr>
-        <w:t xml:space="preserve">A Skylight Rocketry Venture</w:t>
-      </w:r>
     </w:p>
     <w:p>
       <w:pPr>
@@ -177,85 +140,34 @@
     </w:p>
     <w:p>
       <w:pPr>
-        <w:pStyle w:val="BlockText"/>
-      </w:pPr>
-      <w:r>
-        <w:t xml:space="preserve">⚠</w:t>
-      </w:r>
-      <w:r>
-        <w:t xml:space="preserve"> </w:t>
-      </w:r>
-      <w:r>
-        <w:rPr>
-          <w:b/>
-        </w:rPr>
-        <w:t xml:space="preserve">Material re-zoning and canonical-figures update (2026-08-10).</w:t>
-      </w:r>
-      <w:r>
-        <w:t xml:space="preserve"> </w:t>
-      </w:r>
-      <w:r>
-        <w:t xml:space="preserve">The airframe material zoning</w:t>
-      </w:r>
-      <w:r>
-        <w:t xml:space="preserve"> </w:t>
-      </w:r>
-      <w:r>
-        <w:t xml:space="preserve">changed from a two-way PLA/PETG-CF split to a three-way split: ASA-Aero for the upper body that</w:t>
-      </w:r>
-      <w:r>
-        <w:t xml:space="preserve"> </w:t>
-      </w:r>
-      <w:r>
-        <w:t xml:space="preserve">houses avionics (nose, upper body tube), PETG-CF for the lower body and fins, PC-FR</w:t>
-      </w:r>
-      <w:r>
-        <w:t xml:space="preserve"> </w:t>
-      </w:r>
-      <w:r>
-        <w:t xml:space="preserve">for the TVC assembly (motor mount, gimbal). Holding geometry fixed and rescaling each item’s mass</w:t>
-      </w:r>
-      <w:r>
-        <w:t xml:space="preserve"> </w:t>
-      </w:r>
-      <w:r>
-        <w:t xml:space="preserve">by its new material density showed the lighter foamed-ASA upper body plus the heavier PETG-CF fins</w:t>
-      </w:r>
-      <w:r>
-        <w:t xml:space="preserve"> </w:t>
-      </w:r>
-      <w:r>
-        <w:t xml:space="preserve">move CG aft enough, from 48.4 to roughly 50.4 cm against an unchanged 56.8 cm CP, to drop static</w:t>
-      </w:r>
-      <w:r>
-        <w:t xml:space="preserve"> </w:t>
-      </w:r>
-      <w:r>
-        <w:t xml:space="preserve">margin under the 1.0 cal floor this program treats as the minimum for pre-TVC passive stability.</w:t>
-      </w:r>
-      <w:r>
-        <w:t xml:space="preserve"> </w:t>
-      </w:r>
-      <w:r>
-        <w:t xml:space="preserve">Fin span was increased from 72 to 87 mm in the same pass to restore +1.20 cal. Every mass, CG, CP,</w:t>
-      </w:r>
-      <w:r>
-        <w:t xml:space="preserve"> </w:t>
-      </w:r>
-      <w:r>
-        <w:t xml:space="preserve">T/W, and trajectory figure in this document has been updated to the resulting cascade-verified</w:t>
-      </w:r>
-      <w:r>
-        <w:t xml:space="preserve"> </w:t>
-      </w:r>
-      <w:r>
-        <w:t xml:space="preserve">numbers: liftoff 729 g, dry 627 g, CG 50.8 cm, CP 59.3 cm, T/W 2.01/3.54 avg/peak, apogee ≈397 ft</w:t>
-      </w:r>
-      <w:r>
-        <w:t xml:space="preserve"> </w:t>
-      </w:r>
-      <w:r>
-        <w:t xml:space="preserve">(121.1 m) at 6.67 s, independently re-derived from the component mass-moment stack in</w:t>
+        <w:pStyle w:val="FirstParagraph"/>
+      </w:pPr>
+      <w:r>
+        <w:t xml:space="preserve">The airframe uses a three-way material zoning: ASA-Aero for the upper body that houses avionics</w:t>
+      </w:r>
+      <w:r>
+        <w:t xml:space="preserve"> </w:t>
+      </w:r>
+      <w:r>
+        <w:t xml:space="preserve">(nose, upper body tube), PETG-CF for the lower body and fins, and PC-FR for the TVC assembly (motor</w:t>
+      </w:r>
+      <w:r>
+        <w:t xml:space="preserve"> </w:t>
+      </w:r>
+      <w:r>
+        <w:t xml:space="preserve">mount, gimbal). This zoning holds static margin above the program’s 1.0-caliber pre-TVC passive</w:t>
+      </w:r>
+      <w:r>
+        <w:t xml:space="preserve"> </w:t>
+      </w:r>
+      <w:r>
+        <w:t xml:space="preserve">stability floor with 87 mm fins (CG 50.1 cm, CP 59.3 cm, margin 1.31 cal), independently derived from</w:t>
+      </w:r>
+      <w:r>
+        <w:t xml:space="preserve"> </w:t>
+      </w:r>
+      <w:r>
+        <w:t xml:space="preserve">the component mass-moment stack in</w:t>
       </w:r>
       <w:r>
         <w:t xml:space="preserve"> </w:t>
@@ -282,7 +194,19 @@
         <w:t xml:space="preserve">we4_flightsim.py</w:t>
       </w:r>
       <w:r>
-        <w:t xml:space="preserve">’s RK4+Barrowman output and</w:t>
+        <w:t xml:space="preserve">’s</w:t>
+      </w:r>
+      <w:r>
+        <w:t xml:space="preserve"> </w:t>
+      </w:r>
+      <w:r>
+        <w:t xml:space="preserve">RK4+Barrowman output. Liftoff mass is 698 g, dry mass 638 g, T/W 2.10 average / 3.70 peak, and</w:t>
+      </w:r>
+      <w:r>
+        <w:t xml:space="preserve"> </w:t>
+      </w:r>
+      <w:r>
+        <w:t xml:space="preserve">predicted apogee ≈439 ft (133.7 m) at 6.87 s. See</w:t>
       </w:r>
       <w:r>
         <w:t xml:space="preserve"> </w:t>
@@ -291,120 +215,25 @@
         <w:rPr>
           <w:rStyle w:val="VerbatimChar"/>
         </w:rPr>
-        <w:t xml:space="preserve">WYVERN_E4_BUILD_READINESS.md</w:t>
-      </w:r>
-      <w:r>
-        <w:t xml:space="preserve"> </w:t>
-      </w:r>
-      <w:r>
-        <w:t xml:space="preserve">§9.4. This supersedes the prior 792 g/690 g/48.4 cm/324 ft figure set, which was itself a correction</w:t>
-      </w:r>
-      <w:r>
-        <w:t xml:space="preserve"> </w:t>
-      </w:r>
-      <w:r>
-        <w:t xml:space="preserve">of an even older 705 g/603 g/435 ft set predating the i3 camera swap (see</w:t>
-      </w:r>
-    </w:p>
-    <w:p>
-      <w:pPr>
-        <w:pStyle w:val="BlockText"/>
-      </w:pPr>
-      <w:r>
-        <w:rPr>
-          <w:b/>
-        </w:rPr>
-        <w:t xml:space="preserve">2026-08-12 update:</w:t>
-      </w:r>
-      <w:r>
-        <w:t xml:space="preserve"> </w:t>
-      </w:r>
-      <w:r>
-        <w:t xml:space="preserve">a further bottom-up mass rebuild against the current CAD</w:t>
-      </w:r>
-      <w:r>
-        <w:t xml:space="preserve"> </w:t>
-      </w:r>
-      <w:r>
-        <w:t xml:space="preserve">(</w:t>
-      </w:r>
-      <w:r>
-        <w:rPr>
-          <w:rStyle w:val="VerbatimChar"/>
-        </w:rPr>
-        <w:t xml:space="preserve">3D parts/_generator/mass_report.json</w:t>
-      </w:r>
-      <w:r>
-        <w:t xml:space="preserve">) and the real custom-PCB1 avionics stack — the</w:t>
-      </w:r>
-      <w:r>
-        <w:t xml:space="preserve"> </w:t>
-      </w:r>
-      <w:r>
-        <w:t xml:space="preserve">Flight Computer Systems &amp; Avionics and Power sections below have been rewritten to match, replacing</w:t>
-      </w:r>
-      <w:r>
-        <w:t xml:space="preserve"> </w:t>
-      </w:r>
-      <w:r>
-        <w:t xml:space="preserve">the earlier, never-fabricated Pico 2 W/discrete-UBEC description — dropped liftoff to</w:t>
-      </w:r>
-      <w:r>
-        <w:t xml:space="preserve"> </w:t>
-      </w:r>
-      <w:r>
-        <w:rPr>
-          <w:b/>
-        </w:rPr>
-        <w:t xml:space="preserve">698 g</w:t>
-      </w:r>
-      <w:r>
-        <w:t xml:space="preserve"> </w:t>
-      </w:r>
-      <w:r>
-        <w:t xml:space="preserve">(dry 638 g) by moving the Lower BT tube from PETG-CF to ASA-Aero (hoop-stress-checked at SF ≈6–10×</w:t>
-      </w:r>
-      <w:r>
-        <w:t xml:space="preserve"> </w:t>
-      </w:r>
-      <w:r>
-        <w:t xml:space="preserve">under ejection pressure) and removing a discrete UBEC line that duplicated the onboard buck</w:t>
-      </w:r>
-      <w:r>
-        <w:t xml:space="preserve"> </w:t>
-      </w:r>
-      <w:r>
-        <w:t xml:space="preserve">regulator. Every mass/CG/T-W/apogee figure below has been updated to match: CG 50.1 cm, CP 59.3 cm</w:t>
-      </w:r>
-      <w:r>
-        <w:t xml:space="preserve"> </w:t>
-      </w:r>
-      <w:r>
-        <w:t xml:space="preserve">(unchanged), T/W 2.10/3.70 avg/peak, apogee ≈439 ft (133.7 m) at 6.87 s. See</w:t>
-      </w:r>
-      <w:r>
-        <w:t xml:space="preserve"> </w:t>
-      </w:r>
-      <w:r>
-        <w:rPr>
-          <w:rStyle w:val="VerbatimChar"/>
-        </w:rPr>
         <w:t xml:space="preserve">WYVERN_E4_Camera_Solution.md</w:t>
       </w:r>
       <w:r>
-        <w:t xml:space="preserve">). The jetvane test in RQ2 was also redefined in this pass, from a</w:t>
-      </w:r>
-      <w:r>
-        <w:t xml:space="preserve"> </w:t>
-      </w:r>
-      <w:r>
-        <w:t xml:space="preserve">mounted-vane erosion/deflection test to a flat-coupon blast-shield melt-through screen; see RQ2 and</w:t>
-      </w:r>
-      <w:r>
-        <w:t xml:space="preserve"> </w:t>
-      </w:r>
-      <w:r>
-        <w:t xml:space="preserve">§5.4 below.</w:t>
+        <w:t xml:space="preserve"> </w:t>
+      </w:r>
+      <w:r>
+        <w:t xml:space="preserve">for the camera</w:t>
+      </w:r>
+      <w:r>
+        <w:t xml:space="preserve"> </w:t>
+      </w:r>
+      <w:r>
+        <w:t xml:space="preserve">mass allocation. The jetvane test in RQ2 is a flat-coupon blast-shield melt-through screen; see RQ2</w:t>
+      </w:r>
+      <w:r>
+        <w:t xml:space="preserve"> </w:t>
+      </w:r>
+      <w:r>
+        <w:t xml:space="preserve">and §5.4 below.</w:t>
       </w:r>
     </w:p>
     <w:p>
@@ -554,60 +383,50 @@
     </w:p>
     <w:p>
       <w:pPr>
-        <w:pStyle w:val="BlockText"/>
+        <w:pStyle w:val="FirstParagraph"/>
+      </w:pPr>
+      <w:r>
+        <w:t xml:space="preserve">The program addresses five research questions spanning actuator selection, materials, aerofoil</w:t>
+      </w:r>
+      <w:r>
+        <w:t xml:space="preserve"> </w:t>
+      </w:r>
+      <w:r>
+        <w:t xml:space="preserve">performance, stability-model calibration, and control-loop tuning.</w:t>
+      </w:r>
+    </w:p>
+    <w:p>
+      <w:pPr>
+        <w:pStyle w:val="BodyText"/>
       </w:pPr>
       <w:r>
         <w:rPr>
           <w:b/>
         </w:rPr>
-        <w:t xml:space="preserve">2026-08-10 scope restoration.</w:t>
-      </w:r>
-      <w:r>
-        <w:t xml:space="preserve"> </w:t>
-      </w:r>
-      <w:r>
-        <w:t xml:space="preserve">The five-research-question program below is the full, current</w:t>
-      </w:r>
-      <w:r>
-        <w:t xml:space="preserve"> </w:t>
-      </w:r>
-      <w:r>
-        <w:t xml:space="preserve">scope. An interim revision of this proposal had dropped jetvane testing and removed the wind</w:t>
-      </w:r>
-      <w:r>
-        <w:t xml:space="preserve"> </w:t>
-      </w:r>
-      <w:r>
-        <w:t xml:space="preserve">tunnel entirely, consolidating what were originally two separate aerofoil-related questions (fin</w:t>
-      </w:r>
-      <w:r>
-        <w:t xml:space="preserve"> </w:t>
-      </w:r>
-      <w:r>
-        <w:t xml:space="preserve">selection, and tunnel-vs-flight calibration) into one. That consolidation is reversed as of</w:t>
-      </w:r>
-      <w:r>
-        <w:t xml:space="preserve"> </w:t>
-      </w:r>
-      <w:r>
-        <w:t xml:space="preserve">2026-08-10: RQ3 and RQ4 are un-merged below, and jetvane testing returns as part of RQ2.</w:t>
-      </w:r>
-    </w:p>
-    <w:p>
-      <w:pPr>
-        <w:pStyle w:val="FirstParagraph"/>
+        <w:t xml:space="preserve">Research Question 1, Magnetic-Solenoid versus Servo Actuation for Thrust-Vector Control Authority.</w:t>
+      </w:r>
+      <w:r>
+        <w:t xml:space="preserve"> </w:t>
+      </w:r>
+      <w:r>
+        <w:t xml:space="preserve">Substituting a tri-solenoid magnetic gimbal actuator for a servo-driven gimbal actuator as the thrust-vector-control mechanism, evaluated under identical commanded-deflection inputs on two physically separate three-axis thrust-vector load balances (one per actuator class, sharing an identical flexure/DAQ chain so the two datasets are directly comparable), will produce measurable differences in actuation bandwidth, slew rate, step-response overshoot, steady-state deflection error, and maximum achievable gimbal angle, with the objective of determining which actuator class provides superior control authority for a given motor thrust regime.</w:t>
+      </w:r>
+    </w:p>
+    <w:p>
+      <w:pPr>
+        <w:pStyle w:val="BodyText"/>
       </w:pPr>
       <w:r>
         <w:rPr>
           <w:b/>
         </w:rPr>
-        <w:t xml:space="preserve">Research Question 1, Magnetic-Solenoid versus Servo Actuation for Thrust-Vector Control Authority.</w:t>
-      </w:r>
-      <w:r>
-        <w:t xml:space="preserve"> </w:t>
-      </w:r>
-      <w:r>
-        <w:t xml:space="preserve">Substituting a tri-solenoid magnetic gimbal actuator for a servo-driven gimbal actuator as the thrust-vector-control mechanism, evaluated under identical commanded-deflection inputs on two physically separate three-axis thrust-vector load balances (one per actuator class, sharing an identical flexure/DAQ chain so the two datasets are directly comparable), will produce measurable differences in actuation bandwidth, slew rate, step-response overshoot, steady-state deflection error, and maximum achievable gimbal angle, with the objective of determining which actuator class provides superior control authority for a given motor thrust regime.</w:t>
+        <w:t xml:space="preserve">Research Question 2, Zoned Airframe Materials, and Jetvane Blast-Shield Screen.</w:t>
+      </w:r>
+      <w:r>
+        <w:t xml:space="preserve"> </w:t>
+      </w:r>
+      <w:r>
+        <w:t xml:space="preserve">Holding all FDM process parameters constant across ASA-Aero, carbon-filled PETG (PETG-CF), and fire-retardant polycarbonate (PC-FR), this study characterizes and compares each material’s flexural stiffness and modulus under three-point bend loading, and its heat-deflection margin against the measured engine-bay wall temperature from the static-fire campaign, with the objective of justifying the zoned allocation actually flown: ASA-Aero for the unheated avionics-housing upper body, PETG-CF for the lower body and fins, PC-FR for the TVC assembly. The question the comparison answers is whether PC-FR’s fire-retardant grade and PETG-CF’s stiffness are necessary in those zones, or whether a lighter single-material airframe would have sufficed, a decision every low-cost printed TVC vehicle has to make and few justify with data. A second, materials-focused thread under this same research question, run as a blast-shield screen rather than a mounted-vane test, fires the motor directly into a flat 5 mm, 100%-infill coupon plate of each of six candidate materials (PLA, PETG-CF, ABS, ASA-Aero, PC, and PC-FR), measuring melt-through, ablation depth, and slag buildup; materials that survive 5 mm are retested at 4, 3, and 2 mm until they fail, producing a failure-thickness ranking across all six. This is a materials data point, not a flight-hardware decision, since only the servo TVC system flies.</w:t>
       </w:r>
     </w:p>
     <w:p>
@@ -618,30 +437,13 @@
         <w:rPr>
           <w:b/>
         </w:rPr>
-        <w:t xml:space="preserve">Research Question 2, Zoned Airframe Materials, and Jetvane Blast-Shield Screen.</w:t>
-      </w:r>
-      <w:r>
-        <w:t xml:space="preserve"> </w:t>
-      </w:r>
-      <w:r>
-        <w:t xml:space="preserve">Holding all FDM process parameters constant across ASA-Aero, carbon-filled PETG (PETG-CF), and fire-retardant polycarbonate (PC-FR), this study characterizes and compares each material’s flexural stiffness and modulus under three-point bend loading, and its heat-deflection margin against the measured engine-bay wall temperature from the static-fire campaign, with the objective of justifying the zoned allocation actually flown: ASA-Aero for the unheated avionics-housing upper body, PETG-CF for the lower body and fins, PC-FR for the TVC assembly. The question the comparison answers is whether PC-FR’s fire-retardant grade and PETG-CF’s stiffness are necessary in those zones, or whether a lighter single-material airframe would have sufficed, a decision every low-cost printed TVC vehicle has to make and few justify with data. A second, materials-focused thread under this same research question, restored to scope 2026-08-10 after an interim removal and redefined as a blast-shield screen rather than a mounted-vane test, fires the motor directly into a flat 5 mm, 100%-infill coupon plate of each of six candidate materials (PLA, PETG-CF, ABS, ASA-Aero, PC, and PC-FR), measuring melt-through, ablation depth, and slag buildup; materials that survive 5 mm are retested at 4, 3, and 2 mm until they fail, producing a failure-thickness ranking across all six. This is a materials data point, not a flight-hardware decision, since only the servo TVC system flies.</w:t>
-      </w:r>
-    </w:p>
-    <w:p>
-      <w:pPr>
-        <w:pStyle w:val="BodyText"/>
-      </w:pPr>
-      <w:r>
-        <w:rPr>
-          <w:b/>
-        </w:rPr>
         <w:t xml:space="preserve">Research Question 3, Fin Aerofoil Selection via Wind-Tunnel-Measured Performance.</w:t>
       </w:r>
       <w:r>
         <w:t xml:space="preserve"> </w:t>
       </w:r>
       <w:r>
-        <w:t xml:space="preserve">A bench wind tunnel (restored to scope 2026-08-10 after an interim removal, see the scope note above) directly measures lift, drag, and stall behavior for the candidate fin aerofoil sections across the flown fin’s angle-of-attack range, complementing the inviscid 2D vortex-panel CFD solver (</w:t>
+        <w:t xml:space="preserve">A bench wind tunnel directly measures lift, drag, and stall behavior for the candidate fin aerofoil sections across the flown fin’s angle-of-attack range, complementing the inviscid 2D vortex-panel CFD solver (</w:t>
       </w:r>
       <w:r>
         <w:rPr>
@@ -1045,7 +847,7 @@
         <w:t xml:space="preserve"> </w:t>
       </w:r>
       <w:r>
-        <w:t xml:space="preserve">(2026-08-12 recompute; structural rows are real CAD output, not scaled estimates).</w:t>
+        <w:t xml:space="preserve">(structural rows are real CAD output, not scaled estimates).</w:t>
       </w:r>
     </w:p>
     <w:tbl>
@@ -1253,7 +1055,7 @@
               <w:t xml:space="preserve"> </w:t>
             </w:r>
             <w:r>
-              <w:t xml:space="preserve">tube (changed from PETG-CF),</w:t>
+              <w:t xml:space="preserve">tube,</w:t>
             </w:r>
             <w:r>
               <w:t xml:space="preserve"> </w:t>
@@ -1563,19 +1365,19 @@
         <w:pStyle w:val="BodyText"/>
       </w:pPr>
       <w:r>
-        <w:t xml:space="preserve">The Lower BT tube’s PETG-CF→ASA-Aero swap is hoop-stress-checked against the 140 kPa ejection pulse</w:t>
-      </w:r>
-      <w:r>
-        <w:t xml:space="preserve"> </w:t>
-      </w:r>
-      <w:r>
-        <w:t xml:space="preserve">(σ ≈ 2.93 MPa, SF ≈ 6–10×); the bulkhead (direct gas-exposure part) and the motor mount/gimbal</w:t>
-      </w:r>
-      <w:r>
-        <w:t xml:space="preserve"> </w:t>
-      </w:r>
-      <w:r>
-        <w:t xml:space="preserve">(thermal duty at the nozzle) keep their original materials. The custom PCB1 assembly mass is a</w:t>
+        <w:t xml:space="preserve">The Lower BT tube’s ASA-Aero wall is hoop-stress-checked against the 140 kPa ejection pulse</w:t>
+      </w:r>
+      <w:r>
+        <w:t xml:space="preserve"> </w:t>
+      </w:r>
+      <w:r>
+        <w:t xml:space="preserve">(σ ≈ 2.93 MPa, SF ≈ 6–10×); the bulkhead (direct gas-exposure part) uses PETG-CF and the motor</w:t>
+      </w:r>
+      <w:r>
+        <w:t xml:space="preserve"> </w:t>
+      </w:r>
+      <w:r>
+        <w:t xml:space="preserve">mount/gimbal (thermal duty at the nozzle) uses PC-FR. The custom PCB1 assembly mass is a</w:t>
       </w:r>
       <w:r>
         <w:t xml:space="preserve"> </w:t>
@@ -1931,7 +1733,7 @@
         <w:rPr>
           <w:b/>
         </w:rPr>
-        <w:t xml:space="preserve">Wind-tunnel measurement (Research Question 3, restored 2026-08-10).</w:t>
+        <w:t xml:space="preserve">Wind-tunnel measurement (Research Question 3).</w:t>
       </w:r>
       <w:r>
         <w:t xml:space="preserve"> </w:t>
@@ -2659,7 +2461,7 @@
         <w:t xml:space="preserve"> </w:t>
       </w:r>
       <w:r>
-        <w:t xml:space="preserve">All flight avionics functions, attitude estimation, control-law execution, actuator commanding, and data logging, are consolidated onto a single custom flight-computer board (PCB1: a circular Ø62 mm 2-layer PCB built around a bare RP2350B QFN-80 die, dual-core 150 MHz Arm Cortex-M33, 520 KB SRAM, no onboard radio), replacing both the distributed multi-board avionics architecture used in earlier program iterations and an intermediate Raspberry Pi Pico 2 W module concept that was never fabricated. The two processor cores are functionally partitioned to preserve hard real-time determinism: Core 0 executes the 500 Hz thrust-vector-control loop exclusively, reading the gimbal- and body-mounted inertial measurement units, computing nozzle deflection, evaluating the PID control law, and commanding the gimbal servos, and is permitted no blocking operations of any kind. Core 1 drains a logged-data ring buffer to a microSD card over SPI, isolating all non-deterministic I/O latency from the control path; since PCB1 carries no WiFi/BLE radio chip, flight telemetry is logged rather than streamed, with the wireless-telemetry code path retained in firmware but disabled by default (</w:t>
+        <w:t xml:space="preserve">All flight avionics functions, attitude estimation, control-law execution, actuator commanding, and data logging, are consolidated onto a single custom flight-computer board (PCB1: a circular Ø62 mm 2-layer PCB built around a bare RP2350B QFN-80 die, dual-core 150 MHz Arm Cortex-M33, 520 KB SRAM, no onboard radio), replacing the distributed multi-board avionics architecture used in earlier WYVERN generations (§1.2). The two processor cores are functionally partitioned to preserve hard real-time determinism: Core 0 executes the 500 Hz thrust-vector-control loop exclusively, reading the gimbal- and body-mounted inertial measurement units, computing nozzle deflection, evaluating the PID control law, and commanding the gimbal servos, and is permitted no blocking operations of any kind. Core 1 drains a logged-data ring buffer to a microSD card over SPI, isolating all non-deterministic I/O latency from the control path; since PCB1 carries no WiFi/BLE radio chip, flight telemetry is logged rather than streamed, with the wireless-telemetry code path retained in firmware but disabled by default (</w:t>
       </w:r>
       <w:r>
         <w:rPr>
@@ -2778,7 +2580,7 @@
         <w:t xml:space="preserve">Four purpose-built stands are constructed</w:t>
       </w:r>
       <w:r>
-        <w:t xml:space="preserve">, restoring the full test program after an interim reduction: a servo TVC stand, a physically separate magnetic TVC stand, a static-fire stand (calibration, thrust curves, and, restored 2026-08-10, the jetvane blast-shield materials screen), and a bench wind tunnel (restored 2026-08-10) for aerofoil measurement. The three motor-fired stands are fully printable in PETG-CF (selected per Research Question 2 for its motor-plume thermal margin) and instrumented with strain-gauge load cells and HX711 24-bit bridge-amplifier breakouts, logged to onboard microSD by a dedicated data-acquisition microcontroller independent of the flight avionics; the wind tunnel is an unpowered-motor bench rig with its own instrumentation.</w:t>
+        <w:t xml:space="preserve">: a servo TVC stand, a physically separate magnetic TVC stand, a static-fire stand (calibration, thrust curves, and the jetvane blast-shield materials screen), and a bench wind tunnel for aerofoil measurement. The three motor-fired stands are fully printable in PETG-CF (selected per Research Question 2 for its motor-plume thermal margin) and instrumented with strain-gauge load cells and HX711 24-bit bridge-amplifier breakouts, logged to onboard microSD by a dedicated data-acquisition microcontroller independent of the flight avionics; the wind tunnel is an unpowered-motor bench rig with its own instrumentation.</w:t>
       </w:r>
     </w:p>
     <w:p>
@@ -3061,7 +2863,7 @@
         <w:rPr>
           <w:b/>
         </w:rPr>
-        <w:t xml:space="preserve">Jetvane testing, present in earlier revisions of this program and dropped in an interim reduction, is restored to scope as of 2026-08-10 and redefined as a blast-shield materials screen</w:t>
+        <w:t xml:space="preserve">The jetvane test is defined as a blast-shield materials screen</w:t>
       </w:r>
       <w:r>
         <w:t xml:space="preserve">: a flat coupon plate of each candidate material, 5 mm thick at 100% infill, is mounted directly in the exhaust path like a blast shield and fired on. Six materials go through the screen (PLA, PETG-CF, ABS, ASA-Aero, PC, PC-FR); response measured is melt-through, ablation depth, and slag buildup rather than thrust or deflection, and materials surviving 5 mm are retested at 4, then 3, then 2 mm until they fail, feeding Research Question 2’s materials dataset as a failure-thickness ranking. The deflector and mounting hardware are sized to the F15’s 3.45 s burn thermal case. Ground firings use the plugged, 0-delay Estes F15-0 (identical thrust curve to the flight F15-4, but no ejection charge) so that nothing fires into the stand fixtures after burnout.</w:t>
@@ -3081,7 +2883,7 @@
         <w:t xml:space="preserve"> </w:t>
       </w:r>
       <w:r>
-        <w:t xml:space="preserve">A bench aerofoil rig (restored to scope 2026-08-10) provides direct lift/drag/stall measurement for the four candidate fin sections across a 0.5° angle-of-attack sweep, supplying the measured leg of Research Question 3 (fin selection) and Research Question 4 (tunnel-vs-flight calibration) described in §5.2.</w:t>
+        <w:t xml:space="preserve">A bench aerofoil rig provides direct lift/drag/stall measurement for the four candidate fin sections across a 0.5° angle-of-attack sweep, supplying the measured leg of Research Question 3 (fin selection) and Research Question 4 (tunnel-vs-flight calibration) described in §5.2.</w:t>
       </w:r>
     </w:p>
     <w:p>
@@ -3427,7 +3229,7 @@
         <w:pStyle w:val="FirstParagraph"/>
       </w:pPr>
       <w:r>
-        <w:t xml:space="preserve">The computational tier, restored to include a physical-flow-facility cross-check as of 2026-08-10, carries the analytical and inviscid-CFD load for aerodynamics and control, and is held to an explicit verification standard: every simulated result reported here is produced by a version-controlled script, paired with the dataset it wrote, and gated against hard pass/fail criteria rather than inspected qualitatively. Where a physical measurement now exists for a given quantity, the wind-tunnel-measured aerofoil coefficients (§5.2, §5.4), the simulated result is reported alongside it as a cross-check, not as the only available answer.</w:t>
+        <w:t xml:space="preserve">The computational tier carries the analytical and inviscid-CFD load for aerodynamics and control, and is held to an explicit verification standard: every simulated result reported here is produced by a version-controlled script, paired with the dataset it wrote, and gated against hard pass/fail criteria rather than inspected qualitatively. Where a physical measurement now exists for a given quantity, the wind-tunnel-measured aerofoil coefficients (§5.2, §5.4), the simulated result is reported alongside it as a cross-check, not as the only available answer.</w:t>
       </w:r>
     </w:p>
     <w:p>
@@ -3461,7 +3263,7 @@
         <w:t xml:space="preserve"> </w:t>
       </w:r>
       <w:r>
-        <w:t xml:space="preserve">The pitch-plane control model reproduces the flight law as executed: the discrete PID of §5.3 at the firmware’s 500 Hz rate, a first-order servo lag with a measured-class time constant, an explicit control-loop transport delay, gimbal-rate and travel limits, and gust forcing generated from a Dryden-form turbulence spectrum rather than a single sinusoid. Frequency-domain phase and gain margins are evaluated at every point in a burn-time × atmosphere grid, and a candidate gain set is accepted only if it clears the margin target at every point in that grid, the procedure that superseded two earlier gain sets (§5.3).</w:t>
+        <w:t xml:space="preserve">The pitch-plane control model reproduces the flight law as executed: the discrete PID of §5.3 at the firmware’s 500 Hz rate, a first-order servo lag with a measured-class time constant, an explicit control-loop transport delay, gimbal-rate and travel limits, and gust forcing generated from a Dryden-form turbulence spectrum rather than a single sinusoid. Frequency-domain phase and gain margins are evaluated at every point in a burn-time × atmosphere grid, and a candidate gain set is accepted only if it clears the margin target at every point in that grid (§5.3).</w:t>
       </w:r>
     </w:p>
     <w:p>
@@ -3670,7 +3472,7 @@
         <w:pStyle w:val="FirstParagraph"/>
       </w:pPr>
       <w:r>
-        <w:t xml:space="preserve">The program is expected to produce a quantitative, ground-validated comparison of magnetic-solenoid and servo thrust-vector-control actuators, including bandwidth, slew rate, overshoot, and steady-state error for each, directly informing actuator selection for future closed-loop rocketry programs without requiring a dedicated in-flight A/B comparison. A validated thermally-zoned additive-manufacturing material allocation is expected to demonstrate a measurable dry-mass reduction relative to a uniform heat-rated-material baseline, with no corresponding loss of structural margin, offering a transferable design pattern for hobbyist and academic rocketry programs using FDM fabrication; the restored jetvane blast-shield screen adds a failure-thickness ranking across six candidate materials under real motor-plume conditions to that same dataset. Direct wind-tunnel measurement of the candidate fin aerofoil sections, cross-checked against the inviscid vortex-panel CFD prediction, is expected to produce a defensible, measured basis for fin-section selection rather than a purely modeled one, and, combined with flight telemetry, a quantified accuracy bound on Barrowman-class stability prediction for short, low-Reynolds-number, additively-manufactured airframes, expressed as the discrepancy between predicted, tunnel-measured, and telemetry-reconstructed static margin and coast-phase drag coefficient. This three-way comparison (analytical, tunnel, flight) will be released as an open dataset, giving subsequent low-cost programs a defensible error bar to design against with or without their own flow facility. Finally, flight-validated comparison of control-loop gain configurations on a consolidated dual-core single-controller architecture is expected to clarify the practical control-authority and determinism benefits of separating real-time control execution from logging and telemetry I/O on a single low-cost microcontroller, relative to either a single-threaded controller or a distributed multi-board avionics stack. All resulting design files, firmware, simulation code, and flight datasets will be released publicly through the National Association of Rocketry in support of the program’s open-source objectives.</w:t>
+        <w:t xml:space="preserve">The program is expected to produce a quantitative, ground-validated comparison of magnetic-solenoid and servo thrust-vector-control actuators, including bandwidth, slew rate, overshoot, and steady-state error for each, directly informing actuator selection for future closed-loop rocketry programs without requiring a dedicated in-flight A/B comparison. A validated thermally-zoned additive-manufacturing material allocation is expected to demonstrate a measurable dry-mass reduction relative to a uniform heat-rated-material baseline, with no corresponding loss of structural margin, offering a transferable design pattern for hobbyist and academic rocketry programs using FDM fabrication; the jetvane blast-shield screen adds a failure-thickness ranking across six candidate materials under real motor-plume conditions to that same dataset. Direct wind-tunnel measurement of the candidate fin aerofoil sections, cross-checked against the inviscid vortex-panel CFD prediction, is expected to produce a defensible, measured basis for fin-section selection rather than a purely modeled one, and, combined with flight telemetry, a quantified accuracy bound on Barrowman-class stability prediction for short, low-Reynolds-number, additively-manufactured airframes, expressed as the discrepancy between predicted, tunnel-measured, and telemetry-reconstructed static margin and coast-phase drag coefficient. This three-way comparison (analytical, tunnel, flight) will be released as an open dataset, giving subsequent low-cost programs a defensible error bar to design against with or without their own flow facility. Finally, flight-validated comparison of control-loop gain configurations on a consolidated dual-core single-controller architecture is expected to clarify the practical control-authority and determinism benefits of separating real-time control execution from logging and telemetry I/O on a single low-cost microcontroller, relative to either a single-threaded controller or a distributed multi-board avionics stack. All resulting design files, firmware, simulation code, and flight datasets will be released publicly through the National Association of Rocketry in support of the program’s open-source objectives.</w:t>
       </w:r>
     </w:p>
     <w:p>
@@ -3760,89 +3562,6 @@
     </w:p>
     <w:p>
       <w:pPr>
-        <w:pStyle w:val="BlockText"/>
-      </w:pPr>
-      <w:r>
-        <w:t xml:space="preserve">⚠</w:t>
-      </w:r>
-      <w:r>
-        <w:t xml:space="preserve"> </w:t>
-      </w:r>
-      <w:r>
-        <w:rPr>
-          <w:b/>
-        </w:rPr>
-        <w:t xml:space="preserve">2026-08-10 restoration note.</w:t>
-      </w:r>
-      <w:r>
-        <w:t xml:space="preserve"> </w:t>
-      </w:r>
-      <w:r>
-        <w:t xml:space="preserve">The wind-tunnel campaign’s original reference list (Hofferth,</w:t>
-      </w:r>
-      <w:r>
-        <w:t xml:space="preserve"> </w:t>
-      </w:r>
-      <w:r>
-        <w:t xml:space="preserve">Bell &amp; Mehta, Maskell, Mehta &amp; Bradshaw, Pope &amp; Harper, Selig, cited by author name only in</w:t>
-      </w:r>
-      <w:r>
-        <w:t xml:space="preserve"> </w:t>
-      </w:r>
-      <w:r>
-        <w:rPr>
-          <w:rStyle w:val="VerbatimChar"/>
-        </w:rPr>
-        <w:t xml:space="preserve">CONFLICTS.md</w:t>
-      </w:r>
-      <w:r>
-        <w:t xml:space="preserve"> </w:t>
-      </w:r>
-      <w:r>
-        <w:t xml:space="preserve">§7’s removal record, without full bibliographic detail preserved anywhere in the</w:t>
-      </w:r>
-      <w:r>
-        <w:t xml:space="preserve"> </w:t>
-      </w:r>
-      <w:r>
-        <w:t xml:space="preserve">repository) has not been reconstructed here, fabricating full citation entries from an author-name</w:t>
-      </w:r>
-      <w:r>
-        <w:t xml:space="preserve"> </w:t>
-      </w:r>
-      <w:r>
-        <w:t xml:space="preserve">list alone risks getting the year, title, or venue wrong. Kuethe &amp; Chow is added below since the</w:t>
-      </w:r>
-      <w:r>
-        <w:t xml:space="preserve"> </w:t>
-      </w:r>
-      <w:r>
-        <w:t xml:space="preserve">restored CFD code (</w:t>
-      </w:r>
-      <w:r>
-        <w:rPr>
-          <w:rStyle w:val="VerbatimChar"/>
-        </w:rPr>
-        <w:t xml:space="preserve">Simulations/CFD/run_airfoil_cfd.py</w:t>
-      </w:r>
-      <w:r>
-        <w:t xml:space="preserve">) cites it directly as its solver</w:t>
-      </w:r>
-      <w:r>
-        <w:t xml:space="preserve"> </w:t>
-      </w:r>
-      <w:r>
-        <w:t xml:space="preserve">methodology and the full reference is independently verifiable. Re-add the remaining wind-tunnel</w:t>
-      </w:r>
-      <w:r>
-        <w:t xml:space="preserve"> </w:t>
-      </w:r>
-      <w:r>
-        <w:t xml:space="preserve">literature from the original source material before this proposal is treated as submission-final.</w:t>
-      </w:r>
-    </w:p>
-    <w:p>
-      <w:pPr>
         <w:pStyle w:val="FirstParagraph"/>
       </w:pPr>
       <w:r>
@@ -4205,14 +3924,7 @@
         <w:t xml:space="preserve">759–768.</w:t>
       </w:r>
     </w:p>
-    <w:sectPr>
-      <w:headerReference r:id="rId9" w:type="default"/>
-      <w:headerReference r:id="rId10" w:type="first"/>
-      <w:pgSz w:h="15840" w:w="12240" w:orient="portrait"/>
-      <w:pgMar w:bottom="1440" w:top="1440" w:left="1440" w:right="1440" w:header="720" w:footer="720"/>
-      <w:pgNumType w:start="0"/>
-      <w:titlePg w:val="1"/>
-    </w:sectPr>
+    <w:sectPr/>
   </w:body>
 </w:document>
 </file>
@@ -4240,176 +3952,8 @@
 </w:footnotes>
 </file>
 
-<file path=word/header1.xml><?xml version="1.0" encoding="utf-8"?>
-<w:hdr xmlns:mc="http://schemas.openxmlformats.org/markup-compatibility/2006" xmlns:o="urn:schemas-microsoft-com:office:office" xmlns:r="http://schemas.openxmlformats.org/officeDocument/2006/relationships" xmlns:m="http://schemas.openxmlformats.org/officeDocument/2006/math" xmlns:v="urn:schemas-microsoft-com:vml" xmlns:wp="http://schemas.openxmlformats.org/drawingml/2006/wordprocessingDrawing" xmlns:w10="urn:schemas-microsoft-com:office:word" xmlns:w="http://schemas.openxmlformats.org/wordprocessingml/2006/main" xmlns:wne="http://schemas.microsoft.com/office/word/2006/wordml" xmlns:sl="http://schemas.openxmlformats.org/schemaLibrary/2006/main" xmlns:a="http://schemas.openxmlformats.org/drawingml/2006/main" xmlns:pic="http://schemas.openxmlformats.org/drawingml/2006/picture" xmlns:c="http://schemas.openxmlformats.org/drawingml/2006/chart" xmlns:lc="http://schemas.openxmlformats.org/drawingml/2006/lockedCanvas" xmlns:dgm="http://schemas.openxmlformats.org/drawingml/2006/diagram" xmlns:wps="http://schemas.microsoft.com/office/word/2010/wordprocessingShape" xmlns:wpg="http://schemas.microsoft.com/office/word/2010/wordprocessingGroup" xmlns:w14="http://schemas.microsoft.com/office/word/2010/wordml" xmlns:w15="http://schemas.microsoft.com/office/word/2012/wordml" xmlns:w16="http://schemas.microsoft.com/office/word/2018/wordml" xmlns:w16cex="http://schemas.microsoft.com/office/word/2018/wordml/cex" xmlns:w16cid="http://schemas.microsoft.com/office/word/2016/wordml/cid" xmlns="http://schemas.microsoft.com/office/tasks/2019/documenttasks" xmlns:cr="http://schemas.microsoft.com/office/comments/2020/reactions">
-  <w:p>
-    <w:pPr>
-      <w:jc w:val="left"/>
-      <w:rPr/>
-    </w:pPr>
-    <w:hyperlink r:id="rId1">
-      <w:r>
-        <w:rPr>
-          <w:rtl w:val="0"/>
-        </w:rPr>
-        <w:t xml:space="preserve">GTR70E WYVERN Flight Demonstrator Project</w:t>
-      </w:r>
-    </w:hyperlink>
-    <w:r>
-      <w:rPr>
-        <w:rtl w:val="0"/>
-      </w:rPr>
-      <w:t xml:space="preserve">    </w:t>
-    </w:r>
-    <w:r>
-      <w:rPr>
-        <w:rtl w:val="0"/>
-      </w:rPr>
-      <w:t xml:space="preserve">                                                                                </w:t>
-    </w:r>
-    <w:r>
-      <w:rPr/>
-      <w:fldChar w:fldCharType="begin"/>
-      <w:instrText xml:space="preserve">PAGE</w:instrText>
-      <w:fldChar w:fldCharType="separate"/>
-      <w:fldChar w:fldCharType="end"/>
-    </w:r>
-    <w:r>
-      <w:rPr>
-        <w:rtl w:val="0"/>
-      </w:rPr>
-    </w:r>
-  </w:p>
-</w:hdr>
-</file>
-
-<file path=word/header2.xml><?xml version="1.0" encoding="utf-8"?>
-<w:hdr xmlns:mc="http://schemas.openxmlformats.org/markup-compatibility/2006" xmlns:o="urn:schemas-microsoft-com:office:office" xmlns:r="http://schemas.openxmlformats.org/officeDocument/2006/relationships" xmlns:m="http://schemas.openxmlformats.org/officeDocument/2006/math" xmlns:v="urn:schemas-microsoft-com:vml" xmlns:wp="http://schemas.openxmlformats.org/drawingml/2006/wordprocessingDrawing" xmlns:w10="urn:schemas-microsoft-com:office:word" xmlns:w="http://schemas.openxmlformats.org/wordprocessingml/2006/main" xmlns:wne="http://schemas.microsoft.com/office/word/2006/wordml" xmlns:sl="http://schemas.openxmlformats.org/schemaLibrary/2006/main" xmlns:a="http://schemas.openxmlformats.org/drawingml/2006/main" xmlns:pic="http://schemas.openxmlformats.org/drawingml/2006/picture" xmlns:c="http://schemas.openxmlformats.org/drawingml/2006/chart" xmlns:lc="http://schemas.openxmlformats.org/drawingml/2006/lockedCanvas" xmlns:dgm="http://schemas.openxmlformats.org/drawingml/2006/diagram" xmlns:wps="http://schemas.microsoft.com/office/word/2010/wordprocessingShape" xmlns:wpg="http://schemas.microsoft.com/office/word/2010/wordprocessingGroup" xmlns:w14="http://schemas.microsoft.com/office/word/2010/wordml" xmlns:w15="http://schemas.microsoft.com/office/word/2012/wordml" xmlns:w16="http://schemas.microsoft.com/office/word/2018/wordml" xmlns:w16cex="http://schemas.microsoft.com/office/word/2018/wordml/cex" xmlns:w16cid="http://schemas.microsoft.com/office/word/2016/wordml/cid" xmlns="http://schemas.microsoft.com/office/tasks/2019/documenttasks" xmlns:cr="http://schemas.microsoft.com/office/comments/2020/reactions">
-  <w:p>
-    <w:pPr>
-      <w:rPr/>
-    </w:pPr>
-    <w:r>
-      <w:rPr>
-        <w:rtl w:val="0"/>
-      </w:rPr>
-    </w:r>
-  </w:p>
-</w:hdr>
-</file>
-
 <file path=word/numbering.xml><?xml version="1.0" encoding="utf-8"?>
-<w:numbering xmlns:mc="http://schemas.openxmlformats.org/markup-compatibility/2006" xmlns:o="urn:schemas-microsoft-com:office:office" xmlns:r="http://schemas.openxmlformats.org/officeDocument/2006/relationships" xmlns:m="http://schemas.openxmlformats.org/officeDocument/2006/math" xmlns:v="urn:schemas-microsoft-com:vml" xmlns:wp="http://schemas.openxmlformats.org/drawingml/2006/wordprocessingDrawing" xmlns:w10="urn:schemas-microsoft-com:office:word" xmlns:w="http://schemas.openxmlformats.org/wordprocessingml/2006/main" xmlns:wne="http://schemas.microsoft.com/office/word/2006/wordml" xmlns:sl="http://schemas.openxmlformats.org/schemaLibrary/2006/main" xmlns:a="http://schemas.openxmlformats.org/drawingml/2006/main" xmlns:pic="http://schemas.openxmlformats.org/drawingml/2006/picture" xmlns:c="http://schemas.openxmlformats.org/drawingml/2006/chart" xmlns:lc="http://schemas.openxmlformats.org/drawingml/2006/lockedCanvas" xmlns:dgm="http://schemas.openxmlformats.org/drawingml/2006/diagram" xmlns:wps="http://schemas.microsoft.com/office/word/2010/wordprocessingShape" xmlns:wpg="http://schemas.microsoft.com/office/word/2010/wordprocessingGroup" xmlns:w14="http://schemas.microsoft.com/office/word/2010/wordml" xmlns:w15="http://schemas.microsoft.com/office/word/2012/wordml" xmlns:w16="http://schemas.microsoft.com/office/word/2018/wordml" xmlns:w16cex="http://schemas.microsoft.com/office/word/2018/wordml/cex" xmlns:w16cid="http://schemas.microsoft.com/office/word/2016/wordml/cid" xmlns="http://schemas.microsoft.com/office/tasks/2019/documenttasks" xmlns:cr="http://schemas.microsoft.com/office/comments/2020/reactions">
-  <w:abstractNum w:abstractNumId="1">
-    <w:lvl w:ilvl="0">
-      <w:start w:val="1"/>
-      <w:numFmt w:val="bullet"/>
-      <w:lvlText w:val="-"/>
-      <w:lvlJc w:val="left"/>
-      <w:pPr>
-        <w:ind w:left="720" w:hanging="360"/>
-      </w:pPr>
-      <w:rPr>
-        <w:u w:val="none"/>
-      </w:rPr>
-    </w:lvl>
-    <w:lvl w:ilvl="1">
-      <w:start w:val="1"/>
-      <w:numFmt w:val="bullet"/>
-      <w:lvlText w:val="-"/>
-      <w:lvlJc w:val="left"/>
-      <w:pPr>
-        <w:ind w:left="1440" w:hanging="360"/>
-      </w:pPr>
-      <w:rPr>
-        <w:u w:val="none"/>
-      </w:rPr>
-    </w:lvl>
-    <w:lvl w:ilvl="2">
-      <w:start w:val="1"/>
-      <w:numFmt w:val="bullet"/>
-      <w:lvlText w:val="-"/>
-      <w:lvlJc w:val="left"/>
-      <w:pPr>
-        <w:ind w:left="2160" w:hanging="360"/>
-      </w:pPr>
-      <w:rPr>
-        <w:u w:val="none"/>
-      </w:rPr>
-    </w:lvl>
-    <w:lvl w:ilvl="3">
-      <w:start w:val="1"/>
-      <w:numFmt w:val="bullet"/>
-      <w:lvlText w:val="-"/>
-      <w:lvlJc w:val="left"/>
-      <w:pPr>
-        <w:ind w:left="2880" w:hanging="360"/>
-      </w:pPr>
-      <w:rPr>
-        <w:u w:val="none"/>
-      </w:rPr>
-    </w:lvl>
-    <w:lvl w:ilvl="4">
-      <w:start w:val="1"/>
-      <w:numFmt w:val="bullet"/>
-      <w:lvlText w:val="-"/>
-      <w:lvlJc w:val="left"/>
-      <w:pPr>
-        <w:ind w:left="3600" w:hanging="360"/>
-      </w:pPr>
-      <w:rPr>
-        <w:u w:val="none"/>
-      </w:rPr>
-    </w:lvl>
-    <w:lvl w:ilvl="5">
-      <w:start w:val="1"/>
-      <w:numFmt w:val="bullet"/>
-      <w:lvlText w:val="-"/>
-      <w:lvlJc w:val="left"/>
-      <w:pPr>
-        <w:ind w:left="4320" w:hanging="360"/>
-      </w:pPr>
-      <w:rPr>
-        <w:u w:val="none"/>
-      </w:rPr>
-    </w:lvl>
-    <w:lvl w:ilvl="6">
-      <w:start w:val="1"/>
-      <w:numFmt w:val="bullet"/>
-      <w:lvlText w:val="-"/>
-      <w:lvlJc w:val="left"/>
-      <w:pPr>
-        <w:ind w:left="5040" w:hanging="360"/>
-      </w:pPr>
-      <w:rPr>
-        <w:u w:val="none"/>
-      </w:rPr>
-    </w:lvl>
-    <w:lvl w:ilvl="7">
-      <w:start w:val="1"/>
-      <w:numFmt w:val="bullet"/>
-      <w:lvlText w:val="-"/>
-      <w:lvlJc w:val="left"/>
-      <w:pPr>
-        <w:ind w:left="5760" w:hanging="360"/>
-      </w:pPr>
-      <w:rPr>
-        <w:u w:val="none"/>
-      </w:rPr>
-    </w:lvl>
-    <w:lvl w:ilvl="8">
-      <w:start w:val="1"/>
-      <w:numFmt w:val="bullet"/>
-      <w:lvlText w:val="-"/>
-      <w:lvlJc w:val="left"/>
-      <w:pPr>
-        <w:ind w:left="6480" w:hanging="360"/>
-      </w:pPr>
-      <w:rPr>
-        <w:u w:val="none"/>
-      </w:rPr>
-    </w:lvl>
-  </w:abstractNum>
+<w:numbering xmlns:w="http://schemas.openxmlformats.org/wordprocessingml/2006/main">
   <w:abstractNum w:abstractNumId="990">
     <w:nsid w:val="2c1ae401"/>
     <w:multiLevelType w:val="multilevel"/>
@@ -4616,9 +4160,6 @@
       </w:pPr>
     </w:lvl>
   </w:abstractNum>
-  <w:num w:numId="1">
-    <w:abstractNumId w:val="1"/>
-  </w:num>
   <w:num w:numId="1000">
     <w:abstractNumId w:val="990"/>
   </w:num>
@@ -4629,166 +4170,451 @@
 </file>
 
 <file path=word/styles.xml><?xml version="1.0" encoding="utf-8"?>
-<w:styles xmlns:mc="http://schemas.openxmlformats.org/markup-compatibility/2006" xmlns:o="urn:schemas-microsoft-com:office:office" xmlns:r="http://schemas.openxmlformats.org/officeDocument/2006/relationships" xmlns:m="http://schemas.openxmlformats.org/officeDocument/2006/math" xmlns:v="urn:schemas-microsoft-com:vml" xmlns:wp="http://schemas.openxmlformats.org/drawingml/2006/wordprocessingDrawing" xmlns:w10="urn:schemas-microsoft-com:office:word" xmlns:w="http://schemas.openxmlformats.org/wordprocessingml/2006/main" xmlns:wne="http://schemas.microsoft.com/office/word/2006/wordml" xmlns:sl="http://schemas.openxmlformats.org/schemaLibrary/2006/main" xmlns:a="http://schemas.openxmlformats.org/drawingml/2006/main" xmlns:pic="http://schemas.openxmlformats.org/drawingml/2006/picture" xmlns:c="http://schemas.openxmlformats.org/drawingml/2006/chart" xmlns:lc="http://schemas.openxmlformats.org/drawingml/2006/lockedCanvas" xmlns:dgm="http://schemas.openxmlformats.org/drawingml/2006/diagram" xmlns:wps="http://schemas.microsoft.com/office/word/2010/wordprocessingShape" xmlns:wpg="http://schemas.microsoft.com/office/word/2010/wordprocessingGroup" xmlns:w14="http://schemas.microsoft.com/office/word/2010/wordml" xmlns:w15="http://schemas.microsoft.com/office/word/2012/wordml" xmlns:w16="http://schemas.microsoft.com/office/word/2018/wordml" xmlns:w16cex="http://schemas.microsoft.com/office/word/2018/wordml/cex" xmlns:w16cid="http://schemas.microsoft.com/office/word/2016/wordml/cid" xmlns="http://schemas.microsoft.com/office/tasks/2019/documenttasks" xmlns:cr="http://schemas.microsoft.com/office/comments/2020/reactions">
+<w:styles xmlns:r="http://schemas.openxmlformats.org/officeDocument/2006/relationships" xmlns:w="http://schemas.openxmlformats.org/wordprocessingml/2006/main">
   <w:docDefaults>
     <w:rPrDefault>
       <w:rPr>
+        <w:rFonts w:asciiTheme="minorHAnsi" w:eastAsiaTheme="minorHAnsi" w:hAnsiTheme="minorHAnsi" w:cstheme="minorBidi"/>
         <w:sz w:val="24"/>
         <w:szCs w:val="24"/>
-        <w:lang w:val="en"/>
+        <w:lang w:val="en-US" w:eastAsia="en-US" w:bidi="ar-SA"/>
       </w:rPr>
     </w:rPrDefault>
     <w:pPrDefault>
       <w:pPr>
-        <w:spacing w:line="276" w:lineRule="auto"/>
-        <w:jc w:val="both"/>
+        <w:spacing w:after="200"/>
       </w:pPr>
     </w:pPrDefault>
   </w:docDefaults>
-  <w:style w:type="table" w:styleId="TableNormal" w:default="1">
-    <w:name w:val="TableNormal"/>
-    <w:tblPr>
-      <w:tblCellMar>
-        <w:top w:w="100.0" w:type="dxa"/>
-        <w:left w:w="100.0" w:type="dxa"/>
-        <w:bottom w:w="100.0" w:type="dxa"/>
-        <w:right w:w="100.0" w:type="dxa"/>
-      </w:tblCellMar>
-    </w:tblPr>
-  </w:style>
-  <w:style w:type="paragraph" w:styleId="Normal" w:default="1">
-    <w:name w:val="normal"/>
-  </w:style>
-  <w:style w:type="paragraph" w:styleId="Heading1">
-    <w:name w:val="heading 1"/>
+  <w:latentStyles w:defLockedState="0" w:defUIPriority="0" w:defSemiHidden="0" w:defUnhideWhenUsed="0" w:defQFormat="0" w:count="276"/>
+  <w:style w:type="paragraph" w:default="1" w:styleId="Normal">
+    <w:name w:val="Normal"/>
+    <w:qFormat/>
+  </w:style>
+  <w:style w:type="paragraph" w:styleId="BodyText">
+    <w:name w:val="Body Text"/>
     <w:basedOn w:val="Normal"/>
-    <w:next w:val="Normal"/>
+    <w:link w:val="BodyTextChar"/>
     <w:pPr>
-      <w:keepNext w:val="1"/>
-      <w:keepLines w:val="1"/>
+      <w:spacing w:before="180" w:after="180"/>
+    </w:pPr>
+    <w:qFormat/>
+  </w:style>
+  <w:style w:type="paragraph" w:customStyle="1" w:styleId="FirstParagraph">
+    <w:name w:val="First Paragraph"/>
+    <w:basedOn w:val="BodyText"/>
+    <w:next w:val="BodyText"/>
+    <w:qFormat/>
+  </w:style>
+  <w:style w:type="paragraph" w:customStyle="1" w:styleId="Compact">
+    <w:name w:val="Compact"/>
+    <w:basedOn w:val="BodyText"/>
+    <w:qFormat/>
+    <w:pPr>
+      <w:spacing w:before="36" w:after="36"/>
+    </w:pPr>
+  </w:style>
+  <w:style w:type="paragraph" w:styleId="Title">
+    <w:name w:val="Title"/>
+    <w:basedOn w:val="Normal"/>
+    <w:next w:val="BodyText"/>
+    <w:qFormat/>
+    <w:pPr>
+      <w:keepNext/>
+      <w:keepLines/>
+      <w:spacing w:before="480" w:after="240"/>
+      <w:jc w:val="center"/>
     </w:pPr>
     <w:rPr>
-      <w:b w:val="1"/>
-      <w:bCs w:val="1"/>
-      <w:sz w:val="42"/>
-      <w:szCs w:val="42"/>
+      <w:rFonts w:asciiTheme="majorHAnsi" w:eastAsiaTheme="majorEastAsia" w:hAnsiTheme="majorHAnsi" w:cstheme="majorBidi"/>
+      <w:b/>
+      <w:bCs/>
+      <w:color w:val="345A8A" w:themeColor="accent1" w:themeShade="B5"/>
+      <w:sz w:val="36"/>
+      <w:szCs w:val="36"/>
     </w:rPr>
   </w:style>
-  <w:style w:type="paragraph" w:styleId="Heading2">
-    <w:name w:val="heading 2"/>
-    <w:basedOn w:val="Normal"/>
-    <w:next w:val="Normal"/>
+  <w:style w:type="paragraph" w:styleId="Subtitle">
+    <w:name w:val="Subtitle"/>
+    <w:basedOn w:val="Title"/>
+    <w:next w:val="BodyText"/>
+    <w:qFormat/>
     <w:pPr>
-      <w:keepNext w:val="1"/>
-      <w:keepLines w:val="1"/>
-      <w:spacing w:after="40" w:lineRule="auto"/>
+      <w:keepNext/>
+      <w:keepLines/>
+      <w:spacing w:before="240" w:after="240"/>
+      <w:jc w:val="center"/>
     </w:pPr>
     <w:rPr>
-      <w:b w:val="1"/>
-      <w:bCs w:val="1"/>
-      <w:sz w:val="34"/>
-      <w:szCs w:val="34"/>
+      <w:sz w:val="30"/>
+      <w:szCs w:val="30"/>
     </w:rPr>
   </w:style>
-  <w:style w:type="paragraph" w:styleId="Heading3">
-    <w:name w:val="heading 3"/>
+  <w:style w:type="paragraph" w:customStyle="1" w:styleId="Author">
+    <w:name w:val="Author"/>
+    <w:next w:val="BodyText"/>
+    <w:qFormat/>
+    <w:pPr>
+      <w:keepNext/>
+      <w:keepLines/>
+      <w:jc w:val="center"/>
+    </w:pPr>
+  </w:style>
+  <w:style w:type="paragraph" w:styleId="Date">
+    <w:name w:val="Date"/>
+    <w:next w:val="BodyText"/>
+    <w:qFormat/>
+    <w:pPr>
+      <w:keepNext/>
+      <w:keepLines/>
+      <w:jc w:val="center"/>
+    </w:pPr>
+  </w:style>
+  <w:style w:type="paragraph" w:customStyle="1" w:styleId="Abstract">
+    <w:name w:val="Abstract"/>
     <w:basedOn w:val="Normal"/>
-    <w:next w:val="Normal"/>
+    <w:next w:val="BodyText"/>
+    <w:qFormat/>
     <w:pPr>
-      <w:keepNext w:val="1"/>
-      <w:keepLines w:val="1"/>
+      <w:keepNext/>
+      <w:keepLines/>
+      <w:spacing w:before="300" w:after="300"/>
     </w:pPr>
     <w:rPr>
-      <w:b w:val="1"/>
-      <w:bCs w:val="1"/>
+      <w:sz w:val="20"/>
+      <w:szCs w:val="20"/>
+    </w:rPr>
+  </w:style>
+  <w:style w:type="paragraph" w:styleId="Bibliography">
+    <w:name w:val="Bibliography"/>
+    <w:basedOn w:val="Normal"/>
+    <w:next w:val="Bibliography"/>
+    <w:qFormat/>
+    <w:pPr/>
+    <w:rPr/>
+  </w:style>
+  <w:style w:type="paragraph" w:styleId="Heading1">
+    <w:name w:val="Heading 1"/>
+    <w:basedOn w:val="Normal"/>
+    <w:next w:val="BodyText"/>
+    <w:uiPriority w:val="9"/>
+    <w:qFormat/>
+    <w:pPr>
+      <w:keepNext/>
+      <w:keepLines/>
+      <w:spacing w:before="480" w:after="0"/>
+      <w:outlineLvl w:val="0"/>
+    </w:pPr>
+    <w:rPr>
+      <w:rFonts w:asciiTheme="majorHAnsi" w:eastAsiaTheme="majorEastAsia" w:hAnsiTheme="majorHAnsi" w:cstheme="majorBidi"/>
+      <w:b/>
+      <w:bCs/>
+      <w:color w:val="4F81BD" w:themeColor="accent1"/>
+      <w:sz w:val="32"/>
+      <w:szCs w:val="32"/>
+    </w:rPr>
+  </w:style>
+  <w:style w:type="paragraph" w:styleId="Heading2">
+    <w:name w:val="Heading 2"/>
+    <w:basedOn w:val="Normal"/>
+    <w:next w:val="BodyText"/>
+    <w:uiPriority w:val="9"/>
+    <w:unhideWhenUsed/>
+    <w:qFormat/>
+    <w:pPr>
+      <w:keepNext/>
+      <w:keepLines/>
+      <w:spacing w:before="200" w:after="0"/>
+      <w:outlineLvl w:val="1"/>
+    </w:pPr>
+    <w:rPr>
+      <w:rFonts w:asciiTheme="majorHAnsi" w:eastAsiaTheme="majorEastAsia" w:hAnsiTheme="majorHAnsi" w:cstheme="majorBidi"/>
+      <w:b/>
+      <w:bCs/>
+      <w:color w:val="4F81BD" w:themeColor="accent1"/>
       <w:sz w:val="28"/>
       <w:szCs w:val="28"/>
     </w:rPr>
   </w:style>
-  <w:style w:type="paragraph" w:styleId="Heading4">
-    <w:name w:val="heading 4"/>
+  <w:style w:type="paragraph" w:styleId="Heading3">
+    <w:name w:val="Heading 3"/>
     <w:basedOn w:val="Normal"/>
-    <w:next w:val="Normal"/>
+    <w:next w:val="BodyText"/>
+    <w:uiPriority w:val="9"/>
+    <w:unhideWhenUsed/>
+    <w:qFormat/>
     <w:pPr>
-      <w:keepNext w:val="1"/>
-      <w:keepLines w:val="1"/>
-      <w:spacing w:after="40" w:lineRule="auto"/>
+      <w:keepNext/>
+      <w:keepLines/>
+      <w:spacing w:before="200" w:after="0"/>
+      <w:outlineLvl w:val="2"/>
     </w:pPr>
     <w:rPr>
-      <w:b w:val="1"/>
-      <w:bCs w:val="1"/>
-      <w:i w:val="1"/>
-      <w:iCs w:val="1"/>
-      <w:sz w:val="28"/>
-      <w:szCs w:val="28"/>
+      <w:rFonts w:asciiTheme="majorHAnsi" w:eastAsiaTheme="majorEastAsia" w:hAnsiTheme="majorHAnsi" w:cstheme="majorBidi"/>
+      <w:b/>
+      <w:bCs/>
+      <w:color w:val="4F81BD" w:themeColor="accent1"/>
+      <w:sz w:val="24"/>
+      <w:szCs w:val="24"/>
     </w:rPr>
   </w:style>
-  <w:style w:type="paragraph" w:styleId="Heading5">
-    <w:name w:val="heading 5"/>
+  <w:style w:type="paragraph" w:styleId="Heading4">
+    <w:name w:val="Heading 4"/>
     <w:basedOn w:val="Normal"/>
-    <w:next w:val="Normal"/>
+    <w:next w:val="BodyText"/>
+    <w:uiPriority w:val="9"/>
+    <w:unhideWhenUsed/>
+    <w:qFormat/>
     <w:pPr>
-      <w:keepNext w:val="1"/>
-      <w:keepLines w:val="1"/>
+      <w:keepNext/>
+      <w:keepLines/>
+      <w:spacing w:before="200" w:after="0"/>
+      <w:outlineLvl w:val="3"/>
     </w:pPr>
     <w:rPr>
-      <w:b w:val="1"/>
-      <w:bCs w:val="1"/>
-      <w:sz w:val="26"/>
-      <w:szCs w:val="26"/>
-      <w:u w:val="single"/>
+      <w:rFonts w:asciiTheme="majorHAnsi" w:eastAsiaTheme="majorEastAsia" w:hAnsiTheme="majorHAnsi" w:cstheme="majorBidi"/>
+      <w:i/>
+      <w:bCs/>
+      <w:color w:val="4F81BD" w:themeColor="accent1"/>
+      <w:sz w:val="24"/>
+      <w:szCs w:val="24"/>
     </w:rPr>
   </w:style>
-  <w:style w:type="paragraph" w:styleId="Heading6">
-    <w:name w:val="heading 6"/>
+  <w:style w:type="paragraph" w:styleId="Heading5">
+    <w:name w:val="Heading 5"/>
     <w:basedOn w:val="Normal"/>
-    <w:next w:val="Normal"/>
+    <w:next w:val="BodyText"/>
+    <w:uiPriority w:val="9"/>
+    <w:unhideWhenUsed/>
+    <w:qFormat/>
     <w:pPr>
-      <w:keepNext w:val="1"/>
-      <w:keepLines w:val="1"/>
-      <w:pageBreakBefore w:val="0"/>
-      <w:spacing w:after="80" w:before="240" w:lineRule="auto"/>
+      <w:keepNext/>
+      <w:keepLines/>
+      <w:spacing w:before="200" w:after="0"/>
+      <w:outlineLvl w:val="4"/>
     </w:pPr>
     <w:rPr>
-      <w:i w:val="1"/>
-      <w:iCs w:val="1"/>
-      <w:color w:val="666666"/>
-      <w:sz w:val="22"/>
-      <w:szCs w:val="22"/>
+      <w:rFonts w:asciiTheme="majorHAnsi" w:eastAsiaTheme="majorEastAsia" w:hAnsiTheme="majorHAnsi" w:cstheme="majorBidi"/>
+      <w:iCs/>
+      <w:color w:val="4F81BD" w:themeColor="accent1"/>
+      <w:sz w:val="24"/>
+      <w:szCs w:val="24"/>
     </w:rPr>
   </w:style>
-  <w:style w:type="paragraph" w:styleId="Title">
-    <w:name w:val="Title"/>
+  <w:style w:type="paragraph" w:styleId="Heading6">
+    <w:name w:val="Heading 6"/>
     <w:basedOn w:val="Normal"/>
-    <w:next w:val="Normal"/>
+    <w:next w:val="BodyText"/>
+    <w:uiPriority w:val="9"/>
+    <w:unhideWhenUsed/>
+    <w:qFormat/>
     <w:pPr>
-      <w:keepNext w:val="1"/>
-      <w:keepLines w:val="1"/>
-      <w:pageBreakBefore w:val="0"/>
-      <w:spacing w:after="60" w:before="0" w:lineRule="auto"/>
+      <w:keepNext/>
+      <w:keepLines/>
+      <w:spacing w:before="200" w:after="0"/>
+      <w:outlineLvl w:val="5"/>
     </w:pPr>
     <w:rPr>
-      <w:sz w:val="52"/>
-      <w:szCs w:val="52"/>
+      <w:rFonts w:asciiTheme="majorHAnsi" w:eastAsiaTheme="majorEastAsia" w:hAnsiTheme="majorHAnsi" w:cstheme="majorBidi"/>
+      <w:color w:val="4F81BD" w:themeColor="accent1"/>
+      <w:sz w:val="24"/>
+      <w:szCs w:val="24"/>
     </w:rPr>
   </w:style>
-  <w:style w:type="paragraph" w:styleId="Subtitle">
-    <w:name w:val="Subtitle"/>
+  <w:style w:type="paragraph" w:styleId="Heading7">
+    <w:name w:val="Heading 7"/>
     <w:basedOn w:val="Normal"/>
-    <w:next w:val="Normal"/>
+    <w:next w:val="BodyText"/>
+    <w:uiPriority w:val="9"/>
+    <w:unhideWhenUsed/>
+    <w:qFormat/>
     <w:pPr>
-      <w:keepNext w:val="1"/>
-      <w:keepLines w:val="1"/>
-      <w:pageBreakBefore w:val="0"/>
-      <w:spacing w:after="320" w:before="0" w:lineRule="auto"/>
+      <w:keepNext/>
+      <w:keepLines/>
+      <w:spacing w:before="200" w:after="0"/>
+      <w:outlineLvl w:val="6"/>
     </w:pPr>
     <w:rPr>
-      <w:rFonts w:ascii="Arial" w:cs="Arial" w:eastAsia="Arial" w:hAnsi="Arial"/>
-      <w:i w:val="0"/>
-      <w:iCs w:val="0"/>
-      <w:color w:val="666666"/>
-      <w:sz w:val="30"/>
-      <w:szCs w:val="30"/>
+      <w:rFonts w:asciiTheme="majorHAnsi" w:eastAsiaTheme="majorEastAsia" w:hAnsiTheme="majorHAnsi" w:cstheme="majorBidi"/>
+      <w:color w:val="4F81BD" w:themeColor="accent1"/>
+      <w:sz w:val="24"/>
+      <w:szCs w:val="24"/>
+    </w:rPr>
+  </w:style>
+  <w:style w:type="paragraph" w:styleId="Heading8">
+    <w:name w:val="Heading 8"/>
+    <w:basedOn w:val="Normal"/>
+    <w:next w:val="BodyText"/>
+    <w:uiPriority w:val="9"/>
+    <w:unhideWhenUsed/>
+    <w:qFormat/>
+    <w:pPr>
+      <w:keepNext/>
+      <w:keepLines/>
+      <w:spacing w:before="200" w:after="0"/>
+      <w:outlineLvl w:val="7"/>
+    </w:pPr>
+    <w:rPr>
+      <w:rFonts w:asciiTheme="majorHAnsi" w:eastAsiaTheme="majorEastAsia" w:hAnsiTheme="majorHAnsi" w:cstheme="majorBidi"/>
+      <w:color w:val="4F81BD" w:themeColor="accent1"/>
+      <w:sz w:val="24"/>
+      <w:szCs w:val="24"/>
+    </w:rPr>
+  </w:style>
+  <w:style w:type="paragraph" w:styleId="Heading9">
+    <w:name w:val="Heading 9"/>
+    <w:basedOn w:val="Normal"/>
+    <w:next w:val="BodyText"/>
+    <w:uiPriority w:val="9"/>
+    <w:unhideWhenUsed/>
+    <w:qFormat/>
+    <w:pPr>
+      <w:keepNext/>
+      <w:keepLines/>
+      <w:spacing w:before="200" w:after="0"/>
+      <w:outlineLvl w:val="8"/>
+    </w:pPr>
+    <w:rPr>
+      <w:rFonts w:asciiTheme="majorHAnsi" w:eastAsiaTheme="majorEastAsia" w:hAnsiTheme="majorHAnsi" w:cstheme="majorBidi"/>
+      <w:color w:val="4F81BD" w:themeColor="accent1"/>
+      <w:sz w:val="24"/>
+      <w:szCs w:val="24"/>
+    </w:rPr>
+  </w:style>
+  <w:style w:type="paragraph" w:styleId="BlockText">
+    <w:name w:val="Block Text"/>
+    <w:basedOn w:val="BodyText"/>
+    <w:next w:val="BodyText"/>
+    <w:uiPriority w:val="9"/>
+    <w:unhideWhenUsed/>
+    <w:qFormat/>
+    <w:pPr>
+      <w:spacing w:before="100" w:after="100"/>
+      <w:ind w:firstLine="0" w:left="480" w:right="480"/>
+    </w:pPr>
+  </w:style>
+  <w:style w:type="paragraph" w:styleId="FootnoteText">
+    <w:name w:val="Footnote Text"/>
+    <w:basedOn w:val="Normal"/>
+    <w:next w:val="FootnoteText"/>
+    <w:uiPriority w:val="9"/>
+    <w:unhideWhenUsed/>
+    <w:qFormat/>
+  </w:style>
+  <w:style w:type="character" w:default="1" w:styleId="DefaultParagraphFont">
+    <w:name w:val="Default Paragraph Font"/>
+    <w:semiHidden/>
+    <w:unhideWhenUsed/>
+  </w:style>
+  <w:style w:type="table" w:default="1" w:styleId="Table">
+    <w:name w:val="Table"/>
+    <w:basedOn w:val="TableNormal"/>
+    <w:semiHidden/>
+    <w:unhideWhenUsed/>
+    <w:qFormat/>
+    <w:tblPr>
+      <w:tblInd w:w="0" w:type="dxa"/>
+      <w:tblCellMar>
+        <w:top w:w="0" w:type="dxa"/>
+        <w:left w:w="108" w:type="dxa"/>
+        <w:bottom w:w="0" w:type="dxa"/>
+        <w:right w:w="108" w:type="dxa"/>
+      </w:tblCellMar>
+    </w:tblPr>
+  </w:style>
+  <w:style w:type="paragraph" w:customStyle="1" w:styleId="DefinitionTerm">
+    <w:name w:val="Definition Term"/>
+    <w:basedOn w:val="Normal"/>
+    <w:next w:val="Definition"/>
+    <w:pPr>
+      <w:keepNext/>
+      <w:keepLines/>
+      <w:spacing w:after="0"/>
+    </w:pPr>
+    <w:rPr>
+      <w:b/>
+    </w:rPr>
+  </w:style>
+  <w:style w:type="paragraph" w:customStyle="1" w:styleId="Definition">
+    <w:name w:val="Definition"/>
+    <w:basedOn w:val="Normal"/>
+  </w:style>
+  <w:style w:type="paragraph" w:styleId="Caption">
+    <w:name w:val="Caption"/>
+    <w:basedOn w:val="Normal"/>
+    <w:link w:val="BodyTextChar"/>
+    <w:pPr>
+      <w:spacing w:before="0" w:after="120"/>
+    </w:pPr>
+    <w:rPr>
+      <w:i/>
+    </w:rPr>
+  </w:style>
+  <w:style w:type="paragraph" w:customStyle="1" w:styleId="TableCaption">
+    <w:name w:val="Table Caption"/>
+    <w:basedOn w:val="Caption"/>
+    <w:pPr>
+      <w:keepNext/>
+    </w:pPr>
+  </w:style>
+  <w:style w:type="paragraph" w:customStyle="1" w:styleId="ImageCaption">
+    <w:name w:val="Image Caption"/>
+    <w:basedOn w:val="Caption"/>
+  </w:style>
+  <w:style w:type="paragraph" w:customStyle="1" w:styleId="Figure">
+    <w:name w:val="Figure"/>
+    <w:basedOn w:val="Normal"/>
+  </w:style>
+  <w:style w:type="paragraph" w:customStyle="1" w:styleId="CaptionedFigure">
+    <w:name w:val="Captioned Figure"/>
+    <w:basedOn w:val="Figure"/>
+    <w:pPr>
+      <w:keepNext/>
+    </w:pPr>
+  </w:style>
+  <w:style w:type="character" w:customStyle="1" w:styleId="BodyTextChar">
+    <w:name w:val="Body Text Char"/>
+    <w:basedOn w:val="DefaultParagraphFont"/>
+    <w:link w:val="BodyText"/>
+  </w:style>
+  <w:style w:type="character" w:customStyle="1" w:styleId="VerbatimChar">
+    <w:name w:val="Verbatim Char"/>
+    <w:basedOn w:val="BodyTextChar"/>
+    <w:rPr>
+      <w:rFonts w:ascii="Consolas" w:hAnsi="Consolas"/>
+      <w:sz w:val="22"/>
+    </w:rPr>
+  </w:style>
+  <w:style w:type="character" w:styleId="FootnoteReference">
+    <w:name w:val="Footnote Reference"/>
+    <w:basedOn w:val="BodyTextChar"/>
+    <w:rPr>
+      <w:vertAlign w:val="superscript"/>
+    </w:rPr>
+  </w:style>
+  <w:style w:type="character" w:styleId="Hyperlink">
+    <w:name w:val="Hyperlink"/>
+    <w:basedOn w:val="BodyTextChar"/>
+    <w:rPr>
+      <w:color w:val="4F81BD" w:themeColor="accent1"/>
+    </w:rPr>
+  </w:style>
+  <w:style w:type="paragraph" w:styleId="TOCHeading">
+    <w:name w:val="TOC Heading"/>
+    <w:basedOn w:val="Heading1"/>
+    <w:next w:val="BodyText"/>
+    <w:uiPriority w:val="39"/>
+    <w:unhideWhenUsed/>
+    <w:qFormat/>
+    <w:pPr>
+      <w:spacing w:before="240" w:line="259" w:lineRule="auto"/>
+      <w:outlineLvl w:val="9"/>
+    </w:pPr>
+    <w:rPr>
+      <w:rFonts w:asciiTheme="majorHAnsi" w:eastAsiaTheme="majorEastAsia" w:hAnsiTheme="majorHAnsi" w:cstheme="majorBidi"/>
+      <w:b w:val="0"/>
+      <w:bCs w:val="0"/>
+      <w:color w:val="365F91" w:themeColor="accent1" w:themeShade="BF"/>
     </w:rPr>
   </w:style>
   <w:style w:type="paragraph" w:customStyle="1" w:styleId="SourceCode">
@@ -5098,7 +4924,6 @@
         <a:font script="Mong" typeface="Mongolian Baiti"/>
         <a:font script="Viet" typeface="Times New Roman"/>
         <a:font script="Uigh" typeface="Microsoft Uighur"/>
-        <a:font script="Geor" typeface="Sylfaen"/>
       </a:majorFont>
       <a:minorFont>
         <a:latin typeface="Cambria"/>
@@ -5133,7 +4958,6 @@
         <a:font script="Mong" typeface="Mongolian Baiti"/>
         <a:font script="Viet" typeface="Arial"/>
         <a:font script="Uigh" typeface="Microsoft Uighur"/>
-        <a:font script="Geor" typeface="Sylfaen"/>
       </a:minorFont>
     </a:fontScheme>
     <a:fmtScheme name="Office">

</xml_diff>